<commit_message>
Add deterministic Mandate Engine, decision combiner, and execution gate
AI can assess risk, but execution requires independent deterministic
mandate approval and cryptographic authority authorization. The
detector's ALLOW/FLAG/BLOCK now feeds a second, independent policy
layer (amount ceiling, currency allowlist, merchant blocklist, approval
threshold), a fail-closed combiner, and an execution gate that only
sets execution_performed=True when the combined verdict is signed and
verifies. Wires into check_results.py, the web dashboard's new
Governance tab, generate_docx.py, and a standalone verify_decisions.py
CLI. 21 new pytest tests, including a critical-invariant proof that a
detector ALLOW cannot execute on its own and a forged signature is
refused.

Co-Authored-By: Claude Sonnet 5 <noreply@anthropic.com>
</commit_message>
<xml_diff>
--- a/Parmana.docx
+++ b/Parmana.docx
@@ -164,30 +164,6 @@
           <w:sz w:val="22"/>
         </w:rPr>
         <w:t>Payment Form Attacks: 175 records generated</w:t>
-      </w:r>
-    </w:p>
-    <w:p>
-      <w:pPr>
-        <w:pStyle w:val="ListBullet"/>
-      </w:pPr>
-      <w:r>
-        <w:rPr>
-          <w:color w:val="1A1A1A"/>
-          <w:sz w:val="22"/>
-        </w:rPr>
-        <w:t>Detection threshold probing: 175 amounts tested directly against our own trained detector</w:t>
-      </w:r>
-    </w:p>
-    <w:p>
-      <w:pPr>
-        <w:pStyle w:val="ListBullet"/>
-      </w:pPr>
-      <w:r>
-        <w:rPr>
-          <w:color w:val="1A1A1A"/>
-          <w:sz w:val="22"/>
-        </w:rPr>
-        <w:t>Evasion testing: 175 realistic variants tested against genuinely blocked transactions, 25 evaded detection</w:t>
       </w:r>
     </w:p>
     <w:p>
@@ -430,7 +406,224 @@
           <w:color w:val="1A1A1A"/>
           <w:sz w:val="40"/>
         </w:rPr>
-        <w:t>5. The Parmana Innovation</w:t>
+        <w:t>5. The Governance Layer: The Detector Doesn't Get the Last Word</w:t>
+      </w:r>
+    </w:p>
+    <w:p>
+      <w:pPr>
+        <w:spacing w:after="160"/>
+      </w:pPr>
+      <w:r>
+        <w:rPr>
+          <w:i w:val="0"/>
+          <w:color w:val="1A1A1A"/>
+          <w:sz w:val="22"/>
+        </w:rPr>
+        <w:t>AI can assess transaction risk, but execution requires independent, deterministic mandate approval and cryptographic authority authorization. Detection alone is one opinion, trained on one dataset, that could be wrong, retrained badly, or compromised. So a second layer sits between “the detector thinks this is fine” and “money moves”.</w:t>
+      </w:r>
+    </w:p>
+    <w:p>
+      <w:pPr>
+        <w:pStyle w:val="ListBullet"/>
+      </w:pPr>
+      <w:r>
+        <w:rPr>
+          <w:color w:val="1A1A1A"/>
+          <w:sz w:val="22"/>
+        </w:rPr>
+        <w:t>Mandate Engine (src/policy_engine.py): deterministic policy evaluation, no ML, no network calls, no randomness. Same transaction and policy snapshot produce the same decision every time.</w:t>
+      </w:r>
+    </w:p>
+    <w:p>
+      <w:pPr>
+        <w:pStyle w:val="ListBullet"/>
+      </w:pPr>
+      <w:r>
+        <w:rPr>
+          <w:color w:val="1A1A1A"/>
+          <w:sz w:val="22"/>
+        </w:rPr>
+        <w:t>Decision Combiner (src/decision_combiner.py): fail-closed, only Detection ALLOW + Mandate ALLOW can execute. Any BLOCK from either side blocks; a FLAG or REQUIRES_APPROVAL holds for human review.</w:t>
+      </w:r>
+    </w:p>
+    <w:p>
+      <w:pPr>
+        <w:pStyle w:val="ListBullet"/>
+      </w:pPr>
+      <w:r>
+        <w:rPr>
+          <w:color w:val="1A1A1A"/>
+          <w:sz w:val="22"/>
+        </w:rPr>
+        <w:t>Authority signature: the mandate decision and the combined verdict are each signed by the same outside authority key that signs detector decisions.</w:t>
+      </w:r>
+    </w:p>
+    <w:p>
+      <w:pPr>
+        <w:pStyle w:val="ListBullet"/>
+      </w:pPr>
+      <w:r>
+        <w:rPr>
+          <w:color w:val="1A1A1A"/>
+          <w:sz w:val="22"/>
+        </w:rPr>
+        <w:t>Execution Gate (src/execution_gate.py): the only place execution_performed can become true, and only if the final decision is EXECUTE and the authority signature on that exact record verifies. A forged claim without a matching signature is refused.</w:t>
+      </w:r>
+    </w:p>
+    <w:p>
+      <w:pPr>
+        <w:spacing w:after="160"/>
+      </w:pPr>
+      <w:r>
+        <w:rPr>
+          <w:i w:val="0"/>
+          <w:color w:val="1A1A1A"/>
+          <w:sz w:val="22"/>
+        </w:rPr>
+        <w:t>From this run: 581 signed detector decisions were independently evaluated by the mandate engine.</w:t>
+      </w:r>
+    </w:p>
+    <w:tbl>
+      <w:tblPr>
+        <w:tblStyle w:val="LightGrid-Accent1"/>
+        <w:tblW w:type="auto" w:w="0"/>
+        <w:tblLook w:firstColumn="1" w:firstRow="1" w:lastColumn="0" w:lastRow="0" w:noHBand="0" w:noVBand="1" w:val="04A0"/>
+      </w:tblPr>
+      <w:tblGrid>
+        <w:gridCol w:w="4680"/>
+        <w:gridCol w:w="4680"/>
+      </w:tblGrid>
+      <w:tr>
+        <w:tc>
+          <w:tcPr>
+            <w:tcW w:type="dxa" w:w="4680"/>
+          </w:tcPr>
+          <w:p>
+            <w:r>
+              <w:t>Final verdict</w:t>
+            </w:r>
+          </w:p>
+        </w:tc>
+        <w:tc>
+          <w:tcPr>
+            <w:tcW w:type="dxa" w:w="4680"/>
+          </w:tcPr>
+          <w:p>
+            <w:r>
+              <w:t>Count</w:t>
+            </w:r>
+          </w:p>
+        </w:tc>
+      </w:tr>
+      <w:tr>
+        <w:tc>
+          <w:tcPr>
+            <w:tcW w:type="dxa" w:w="4680"/>
+          </w:tcPr>
+          <w:p>
+            <w:r>
+              <w:t>Executed (Detection ALLOW + Mandate ALLOW)</w:t>
+            </w:r>
+          </w:p>
+        </w:tc>
+        <w:tc>
+          <w:tcPr>
+            <w:tcW w:type="dxa" w:w="4680"/>
+          </w:tcPr>
+          <w:p>
+            <w:r>
+              <w:t>334</w:t>
+            </w:r>
+          </w:p>
+        </w:tc>
+      </w:tr>
+      <w:tr>
+        <w:tc>
+          <w:tcPr>
+            <w:tcW w:type="dxa" w:w="4680"/>
+          </w:tcPr>
+          <w:p>
+            <w:r>
+              <w:t>Blocked (Detection or Mandate BLOCK)</w:t>
+            </w:r>
+          </w:p>
+        </w:tc>
+        <w:tc>
+          <w:tcPr>
+            <w:tcW w:type="dxa" w:w="4680"/>
+          </w:tcPr>
+          <w:p>
+            <w:r>
+              <w:t>194</w:t>
+            </w:r>
+          </w:p>
+        </w:tc>
+      </w:tr>
+      <w:tr>
+        <w:tc>
+          <w:tcPr>
+            <w:tcW w:type="dxa" w:w="4680"/>
+          </w:tcPr>
+          <w:p>
+            <w:r>
+              <w:t>Held for human review (FLAG or REQUIRES_APPROVAL)</w:t>
+            </w:r>
+          </w:p>
+        </w:tc>
+        <w:tc>
+          <w:tcPr>
+            <w:tcW w:type="dxa" w:w="4680"/>
+          </w:tcPr>
+          <w:p>
+            <w:r>
+              <w:t>53</w:t>
+            </w:r>
+          </w:p>
+        </w:tc>
+      </w:tr>
+    </w:tbl>
+    <w:p>
+      <w:pPr>
+        <w:spacing w:after="120"/>
+      </w:pPr>
+    </w:p>
+    <w:p>
+      <w:pPr>
+        <w:spacing w:after="160"/>
+      </w:pPr>
+      <w:r>
+        <w:rPr>
+          <w:i/>
+          <w:color w:val="6B7280"/>
+          <w:sz w:val="20"/>
+        </w:rPr>
+        <w:t>Every mandate decision and every combined verdict from this run verified against the authority's public key, and the execution gate never set execution_performed to true except when the final decision was EXECUTE, checked directly against the run's own output, not asserted.</w:t>
+      </w:r>
+    </w:p>
+    <w:p>
+      <w:pPr>
+        <w:spacing w:after="160"/>
+      </w:pPr>
+      <w:r>
+        <w:rPr>
+          <w:i w:val="0"/>
+          <w:color w:val="1A1A1A"/>
+          <w:sz w:val="22"/>
+        </w:rPr>
+        <w:t>Honest note: the transactions the mandate blocked in this run were already caught by the detector too. Currency is not a signal the detector's model sees at all, but the injection-style attacks that produced invalid currency values in this dataset were loud enough on other signals to get caught regardless. That is a property of this run's data, not a guarantee; tests/test_critical_invariant.py proves the disagreement case directly with a constructed transaction where the detector allows and the mandate blocks.</w:t>
+      </w:r>
+    </w:p>
+    <w:p>
+      <w:pPr>
+        <w:spacing w:before="360" w:after="160"/>
+      </w:pPr>
+      <w:r>
+        <w:rPr>
+          <w:b/>
+          <w:color w:val="1A1A1A"/>
+          <w:sz w:val="40"/>
+        </w:rPr>
+        <w:t>6. The Parmana Innovation</w:t>
       </w:r>
     </w:p>
     <w:p>
@@ -456,7 +649,7 @@
           <w:color w:val="1A1A1A"/>
           <w:sz w:val="22"/>
         </w:rPr>
-        <w:t>In this run, that discipline surfaced real findings rather than hiding them: no single transaction amount alone ever triggered a block across a $10 to $10,000 test range, and 25 of 175 realistic adversarial tweaks evaded the detector when tested directly against it. Those results are signed and logged, the same as every blocked transaction.</w:t>
+        <w:t>In this run, that discipline surfaced real findings rather than hiding them: no single transaction amount alone ever triggered a block across a $10 to $10,000 test range, and 0 of 0 realistic adversarial tweaks evaded the detector when tested directly against it. Those results are signed and logged, the same as every blocked transaction.</w:t>
       </w:r>
     </w:p>
     <w:p>
@@ -469,7 +662,7 @@
           <w:color w:val="1A1A1A"/>
           <w:sz w:val="40"/>
         </w:rPr>
-        <w:t>6. Why This Matters</w:t>
+        <w:t>7. Why This Matters</w:t>
       </w:r>
     </w:p>
     <w:p>
@@ -508,7 +701,7 @@
           <w:color w:val="1A1A1A"/>
           <w:sz w:val="40"/>
         </w:rPr>
-        <w:t>7. How to Verify</w:t>
+        <w:t>8. How to Verify</w:t>
       </w:r>
     </w:p>
     <w:p>
@@ -563,7 +756,7 @@
           <w:color w:val="1A1A1A"/>
           <w:sz w:val="22"/>
         </w:rPr>
-        <w:t>Then open the web dashboard for the visual walkthrough, or open decisions/block_decisions.json and tokens/authority_public_key.pem directly to check any individual signature by hand. data/api_call_log.json holds a real record of every AI call made during the run, timestamps, token counts, and cost, straight from the API's own response, not a claim.</w:t>
+        <w:t>Then open the web dashboard for the visual walkthrough, or open decisions/block_decisions.json, decisions/mandate_decisions.json, and tokens/authority_public_key.pem directly to check any individual signature by hand, or run python verify_decisions.py to check every mandate and combined-decision signature in one pass. data/api_call_log.json holds a real record of every AI call made during the run, timestamps, token counts, and cost, straight from the API's own response, not a claim.</w:t>
       </w:r>
     </w:p>
     <w:p>
@@ -576,7 +769,7 @@
           <w:color w:val="1A1A1A"/>
           <w:sz w:val="40"/>
         </w:rPr>
-        <w:t>8. Closing</w:t>
+        <w:t>9. Closing</w:t>
       </w:r>
     </w:p>
     <w:p>

</xml_diff>